<commit_message>
Add the plugin kit, form-script kit and four PCF controls; 80+ plugins figure
Six new project records for DataversePluginKit, FormScriptKit and the
PCFControls folders, new project types and a "Published, not deployed"
status, the Apps launcher entries, and the CV's plugin line corrected to
80+ C# plugins across 8 assemblies in the docx, cv.md and the PDF.

Co-Authored-By: Claude Opus 5.5 <noreply@anthropic.com>
</commit_message>
<xml_diff>
--- a/content/source/Baris_Kuzu_CV.docx
+++ b/content/source/Baris_Kuzu_CV.docx
@@ -1,6 +1,6 @@
 
 <file path=word/document.xml><?xml version="1.0" encoding="utf-8"?>
-<w:document xmlns:wpc="http://schemas.microsoft.com/office/word/2010/wordprocessingCanvas" xmlns:cx="http://schemas.microsoft.com/office/drawing/2014/chartex" xmlns:cx1="http://schemas.microsoft.com/office/drawing/2015/9/8/chartex" xmlns:cx2="http://schemas.microsoft.com/office/drawing/2015/10/21/chartex" xmlns:cx3="http://schemas.microsoft.com/office/drawing/2016/5/9/chartex" xmlns:cx4="http://schemas.microsoft.com/office/drawing/2016/5/10/chartex" xmlns:cx5="http://schemas.microsoft.com/office/drawing/2016/5/11/chartex" xmlns:cx6="http://schemas.microsoft.com/office/drawing/2016/5/12/chartex" xmlns:cx7="http://schemas.microsoft.com/office/drawing/2016/5/13/chartex" xmlns:cx8="http://schemas.microsoft.com/office/drawing/2016/5/14/chartex" xmlns:mc="http://schemas.openxmlformats.org/markup-compatibility/2006" xmlns:m="http://schemas.openxmlformats.org/officeDocument/2006/math" xmlns:aink="http://schemas.microsoft.com/office/drawing/2016/ink" xmlns:am3d="http://schemas.microsoft.com/office/drawing/2017/model3d" xmlns:oel="http://schemas.microsoft.com/office/2019/extlst" xmlns:r="http://schemas.openxmlformats.org/officeDocument/2006/relationships" xmlns:wp14="http://schemas.microsoft.com/office/word/2010/wordprocessingDrawing" xmlns:wp="http://schemas.openxmlformats.org/drawingml/2006/wordprocessingDrawing" xmlns:wpg="http://schemas.microsoft.com/office/word/2010/wordprocessingGroup" xmlns:wpi="http://schemas.microsoft.com/office/word/2010/wordprocessingInk" xmlns:wps="http://schemas.microsoft.com/office/word/2010/wordprocessingShape" xmlns:o="urn:schemas-microsoft-com:office:office" xmlns:v="urn:schemas-microsoft-com:vml" xmlns:w10="urn:schemas-microsoft-com:office:word" xmlns:w="http://schemas.openxmlformats.org/wordprocessingml/2006/main" xmlns:w14="http://schemas.microsoft.com/office/word/2010/wordml" xmlns:w15="http://schemas.microsoft.com/office/word/2012/wordml" xmlns:w16cei="http://schemas.microsoft.com/office/word/2026/wordml/cei" xmlns:w16cex="http://schemas.microsoft.com/office/word/2018/wordml/cex" xmlns:w16cid="http://schemas.microsoft.com/office/word/2016/wordml/cid" xmlns:w16="http://schemas.microsoft.com/office/word/2018/wordml" xmlns:w16sdtdh="http://schemas.microsoft.com/office/word/2020/wordml/sdtdatahash" xmlns:w16sdtfl="http://schemas.microsoft.com/office/word/2024/wordml/sdtformatlock" xmlns:w16se="http://schemas.microsoft.com/office/word/2015/wordml/symex" xmlns:w16du="http://schemas.microsoft.com/office/word/2023/wordml/word16du" xmlns:wne="http://schemas.microsoft.com/office/word/2006/wordml" mc:Ignorable="w14 w15 w16se w16cid w16 w16cex w16sdtdh w16sdtfl w16du wp14">
+<w:document xmlns:wpc="http://schemas.microsoft.com/office/word/2010/wordprocessingCanvas" xmlns:cx="http://schemas.microsoft.com/office/drawing/2014/chartex" xmlns:cx1="http://schemas.microsoft.com/office/drawing/2015/9/8/chartex" xmlns:cx2="http://schemas.microsoft.com/office/drawing/2015/10/21/chartex" xmlns:cx3="http://schemas.microsoft.com/office/drawing/2016/5/9/chartex" xmlns:cx4="http://schemas.microsoft.com/office/drawing/2016/5/10/chartex" xmlns:cx5="http://schemas.microsoft.com/office/drawing/2016/5/11/chartex" xmlns:cx6="http://schemas.microsoft.com/office/drawing/2016/5/12/chartex" xmlns:cx7="http://schemas.microsoft.com/office/drawing/2016/5/13/chartex" xmlns:cx8="http://schemas.microsoft.com/office/drawing/2016/5/14/chartex" xmlns:mc="http://schemas.openxmlformats.org/markup-compatibility/2006" xmlns:aink="http://schemas.microsoft.com/office/drawing/2016/ink" xmlns:am3d="http://schemas.microsoft.com/office/drawing/2017/model3d" xmlns:o="urn:schemas-microsoft-com:office:office" xmlns:oel="http://schemas.microsoft.com/office/2019/extlst" xmlns:r="http://schemas.openxmlformats.org/officeDocument/2006/relationships" xmlns:m="http://schemas.openxmlformats.org/officeDocument/2006/math" xmlns:v="urn:schemas-microsoft-com:vml" xmlns:wp14="http://schemas.microsoft.com/office/word/2010/wordprocessingDrawing" xmlns:wp="http://schemas.openxmlformats.org/drawingml/2006/wordprocessingDrawing" xmlns:w10="urn:schemas-microsoft-com:office:word" xmlns:w="http://schemas.openxmlformats.org/wordprocessingml/2006/main" xmlns:w14="http://schemas.microsoft.com/office/word/2010/wordml" xmlns:w15="http://schemas.microsoft.com/office/word/2012/wordml" xmlns:w16cex="http://schemas.microsoft.com/office/word/2018/wordml/cex" xmlns:w16cid="http://schemas.microsoft.com/office/word/2016/wordml/cid" xmlns:w16="http://schemas.microsoft.com/office/word/2018/wordml" xmlns:w16du="http://schemas.microsoft.com/office/word/2023/wordml/word16du" xmlns:w16sdtdh="http://schemas.microsoft.com/office/word/2020/wordml/sdtdatahash" xmlns:w16sdtfl="http://schemas.microsoft.com/office/word/2024/wordml/sdtformatlock" xmlns:w16se="http://schemas.microsoft.com/office/word/2015/wordml/symex" xmlns:wpg="http://schemas.microsoft.com/office/word/2010/wordprocessingGroup" xmlns:wpi="http://schemas.microsoft.com/office/word/2010/wordprocessingInk" xmlns:wne="http://schemas.microsoft.com/office/word/2006/wordml" xmlns:wps="http://schemas.microsoft.com/office/word/2010/wordprocessingShape" mc:Ignorable="w14 w15 w16se w16cid w16 w16cex w16sdtdh w16sdtfl w16du wp14">
   <w:body>
     <w:p>
       <w:pPr>
@@ -41,61 +41,6 @@
           <w:szCs w:val="18"/>
         </w:rPr>
         <w:t xml:space="preserve">Istanbul, Turkey   ·   +90 532 668 9403   ·   bbariskuzu@gmail.com   ·   </w:t>
-      </w:r>
-      <w:r>
-        <w:rPr>
-          <w:color w:val="595959"/>
-          <w:sz w:val="18"/>
-          <w:szCs w:val="18"/>
-        </w:rPr>
-        <w:fldChar w:fldCharType="begin"/>
-      </w:r>
-      <w:r>
-        <w:rPr>
-          <w:color w:val="595959"/>
-          <w:sz w:val="18"/>
-          <w:szCs w:val="18"/>
-        </w:rPr>
-        <w:instrText>HYPERLINK "https://github.com/kh3ldar"</w:instrText>
-      </w:r>
-      <w:r>
-        <w:rPr>
-          <w:color w:val="595959"/>
-          <w:sz w:val="18"/>
-          <w:szCs w:val="18"/>
-        </w:rPr>
-      </w:r>
-      <w:r>
-        <w:rPr>
-          <w:color w:val="595959"/>
-          <w:sz w:val="18"/>
-          <w:szCs w:val="18"/>
-        </w:rPr>
-        <w:fldChar w:fldCharType="separate"/>
-      </w:r>
-      <w:r>
-        <w:rPr>
-          <w:rStyle w:val="Hyperlink"/>
-          <w:sz w:val="18"/>
-          <w:szCs w:val="18"/>
-        </w:rPr>
-        <w:t>github.com/kh3ldar</w:t>
-      </w:r>
-      <w:r>
-        <w:rPr>
-          <w:color w:val="595959"/>
-          <w:sz w:val="18"/>
-          <w:szCs w:val="18"/>
-        </w:rPr>
-        <w:fldChar w:fldCharType="end"/>
-      </w:r>
-      <w:r>
-        <w:rPr>
-          <w:color w:val="595959"/>
-          <w:sz w:val="18"/>
-          <w:szCs w:val="18"/>
-        </w:rPr>
-        <w:t xml:space="preserve">   ·   </w:t>
       </w:r>
       <w:hyperlink r:id="rId5" w:history="1">
         <w:r>
@@ -104,25 +49,25 @@
             <w:sz w:val="18"/>
             <w:szCs w:val="18"/>
           </w:rPr>
-          <w:t>linkedin.com/in/</w:t>
+          <w:t>github.com/kh3ldar</w:t>
         </w:r>
-        <w:proofErr w:type="spellStart"/>
+      </w:hyperlink>
+      <w:r>
+        <w:rPr>
+          <w:color w:val="595959"/>
+          <w:sz w:val="18"/>
+          <w:szCs w:val="18"/>
+        </w:rPr>
+        <w:t xml:space="preserve">   ·   </w:t>
+      </w:r>
+      <w:hyperlink r:id="rId6" w:history="1">
         <w:r>
           <w:rPr>
             <w:rStyle w:val="Hyperlink"/>
             <w:sz w:val="18"/>
             <w:szCs w:val="18"/>
           </w:rPr>
-          <w:t>beratbariskuzu</w:t>
-        </w:r>
-        <w:proofErr w:type="spellEnd"/>
-        <w:r>
-          <w:rPr>
-            <w:rStyle w:val="Hyperlink"/>
-            <w:sz w:val="18"/>
-            <w:szCs w:val="18"/>
-          </w:rPr>
-          <w:t>/</w:t>
+          <w:t>linkedin.com/in/beratbariskuzu/</w:t>
         </w:r>
       </w:hyperlink>
     </w:p>
@@ -209,6 +154,8 @@
       </w:r>
       <w:r>
         <w:tab/>
+      </w:r>
+      <w:r>
         <w:t>PCF  ·  Dataverse Web API  ·  Plugins &amp; Custom APIs  ·  Power Automate</w:t>
       </w:r>
     </w:p>
@@ -221,22 +168,7 @@
       </w:pPr>
       <w:r>
         <w:tab/>
-      </w:r>
-      <w:proofErr w:type="spellStart"/>
-      <w:r>
-        <w:t>FetchXML</w:t>
-      </w:r>
-      <w:proofErr w:type="spellEnd"/>
-      <w:r>
-        <w:t xml:space="preserve">  ·  Power </w:t>
-      </w:r>
-      <w:proofErr w:type="spellStart"/>
-      <w:r>
-        <w:t>Fx</w:t>
-      </w:r>
-      <w:proofErr w:type="spellEnd"/>
-      <w:r>
-        <w:t xml:space="preserve">  ·  Model-driven Apps</w:t>
+        <w:t>FetchXML  ·  Power Fx  ·  Model-driven Apps</w:t>
       </w:r>
     </w:p>
     <w:p>
@@ -322,7 +254,6 @@
       <w:pPr>
         <w:spacing w:before="80" w:after="6"/>
       </w:pPr>
-      <w:proofErr w:type="spellStart"/>
       <w:r>
         <w:rPr>
           <w:b/>
@@ -332,65 +263,8 @@
         </w:rPr>
         <w:t>ProductAddGrid</w:t>
       </w:r>
-      <w:proofErr w:type="spellEnd"/>
       <w:r>
         <w:t xml:space="preserve">  —  multi-entity product entry dialog</w:t>
-      </w:r>
-    </w:p>
-    <w:p>
-      <w:pPr>
-        <w:spacing w:after="60"/>
-      </w:pPr>
-      <w:hyperlink r:id="rId6" w:history="1">
-        <w:r>
-          <w:rPr>
-            <w:rStyle w:val="Hyperlink"/>
-          </w:rPr>
-          <w:t>github.com/kh3ldar/</w:t>
-        </w:r>
-        <w:proofErr w:type="spellStart"/>
-        <w:r>
-          <w:rPr>
-            <w:rStyle w:val="Hyperlink"/>
-          </w:rPr>
-          <w:t>ProductAddGrid</w:t>
-        </w:r>
-        <w:proofErr w:type="spellEnd"/>
-      </w:hyperlink>
-    </w:p>
-    <w:p>
-      <w:pPr>
-        <w:spacing w:after="60"/>
-      </w:pPr>
-      <w:r>
-        <w:t xml:space="preserve">PCF control hosted on a Custom Page, serving opportunities, quotes, orders, and custom tables from one codebase with no per-entity branching. </w:t>
-      </w:r>
-      <w:proofErr w:type="spellStart"/>
-      <w:r>
-        <w:t>Catalog</w:t>
-      </w:r>
-      <w:proofErr w:type="spellEnd"/>
-      <w:r>
-        <w:t xml:space="preserve"> search, inline editing, and in-memory staging committed in a single save, with basket state persisted across reloads. Integrates a Dataverse Custom API for product requests.</w:t>
-      </w:r>
-    </w:p>
-    <w:p>
-      <w:pPr>
-        <w:spacing w:before="80" w:after="6"/>
-      </w:pPr>
-      <w:proofErr w:type="spellStart"/>
-      <w:r>
-        <w:rPr>
-          <w:b/>
-          <w:bCs/>
-          <w:sz w:val="21"/>
-          <w:szCs w:val="21"/>
-        </w:rPr>
-        <w:t>ProductGrid</w:t>
-      </w:r>
-      <w:proofErr w:type="spellEnd"/>
-      <w:r>
-        <w:t xml:space="preserve">  —  view-driven editable grid for Dynamics 365</w:t>
       </w:r>
     </w:p>
     <w:p>
@@ -402,16 +276,46 @@
           <w:rPr>
             <w:rStyle w:val="Hyperlink"/>
           </w:rPr>
-          <w:t>github.com/kh3ldar/</w:t>
+          <w:t>github.com/kh3ldar/ProductAddGrid</w:t>
         </w:r>
-        <w:proofErr w:type="spellStart"/>
+      </w:hyperlink>
+    </w:p>
+    <w:p>
+      <w:pPr>
+        <w:spacing w:after="60"/>
+      </w:pPr>
+      <w:r>
+        <w:t>PCF control hosted on a Custom Page, serving opportunities, quotes, orders, and custom tables from one codebase with no per-entity branching. Catalog search, inline editing, and in-memory staging committed in a single save, with basket state persisted across reloads. Integrates a Dataverse Custom API for product requests.</w:t>
+      </w:r>
+    </w:p>
+    <w:p>
+      <w:pPr>
+        <w:spacing w:before="80" w:after="6"/>
+      </w:pPr>
+      <w:r>
+        <w:rPr>
+          <w:b/>
+          <w:bCs/>
+          <w:sz w:val="21"/>
+          <w:szCs w:val="21"/>
+        </w:rPr>
+        <w:t>ProductGrid</w:t>
+      </w:r>
+      <w:r>
+        <w:t xml:space="preserve">  —  view-driven editable grid for Dynamics 365</w:t>
+      </w:r>
+    </w:p>
+    <w:p>
+      <w:pPr>
+        <w:spacing w:after="60"/>
+      </w:pPr>
+      <w:hyperlink r:id="rId8" w:history="1">
         <w:r>
           <w:rPr>
             <w:rStyle w:val="Hyperlink"/>
           </w:rPr>
-          <w:t>ProductGrid</w:t>
+          <w:t>github.com/kh3ldar/ProductGrid</w:t>
         </w:r>
-        <w:proofErr w:type="spellEnd"/>
       </w:hyperlink>
     </w:p>
     <w:p>
@@ -419,15 +323,7 @@
         <w:spacing w:after="74"/>
       </w:pPr>
       <w:r>
-        <w:t xml:space="preserve">PCF control (TypeScript, React, Fluent UI) replacing the stock </w:t>
-      </w:r>
-      <w:proofErr w:type="spellStart"/>
-      <w:r>
-        <w:t>subgrid</w:t>
-      </w:r>
-      <w:proofErr w:type="spellEnd"/>
-      <w:r>
-        <w:t xml:space="preserve"> where the platform offers no client-side extension point. Cross-table validation that reaches through a lookup before the write commits, per-entity command buttons, and delete guards are declared as JSON — supporting a new entity is a config block, not a code change. Columns and metadata resolve from Dataverse saved views at runtime. English / Turkish localized.</w:t>
+        <w:t>PCF control (TypeScript, React, Fluent UI) replacing the stock subgrid where the platform offers no client-side extension point. Cross-table validation that reaches through a lookup before the write commits, per-entity command buttons, and delete guards are declared as JSON — supporting a new entity is a config block, not a code change. Columns and metadata resolve from Dataverse saved views at runtime. English / Turkish localized.</w:t>
       </w:r>
     </w:p>
     <w:p>
@@ -486,14 +382,12 @@
       <w:pPr>
         <w:spacing w:after="60"/>
       </w:pPr>
-      <w:proofErr w:type="spellStart"/>
       <w:r>
         <w:rPr>
           <w:color w:val="595959"/>
         </w:rPr>
         <w:t>eMind</w:t>
       </w:r>
-      <w:proofErr w:type="spellEnd"/>
       <w:r>
         <w:rPr>
           <w:color w:val="595959"/>
@@ -524,7 +418,13 @@
         <w:spacing w:after="50"/>
       </w:pPr>
       <w:r>
-        <w:t xml:space="preserve">Built and maintain 30+ C# plugin assemblies with a shared services layer, shipped as plugin packages.</w:t>
+        <w:t xml:space="preserve">Built and maintain </w:t>
+      </w:r>
+      <w:r>
+        <w:t>80+ C# plugins across 8 assemblies</w:t>
+      </w:r>
+      <w:r>
+        <w:t xml:space="preserve"> with a shared services layer, shipped as plugin packages.</w:t>
       </w:r>
     </w:p>
     <w:p>
@@ -629,19 +529,11 @@
       <w:pPr>
         <w:spacing w:after="60"/>
       </w:pPr>
-      <w:proofErr w:type="spellStart"/>
       <w:r>
         <w:rPr>
           <w:color w:val="595959"/>
         </w:rPr>
-        <w:t>Conectys</w:t>
-      </w:r>
-      <w:proofErr w:type="spellEnd"/>
-      <w:r>
-        <w:rPr>
-          <w:color w:val="595959"/>
-        </w:rPr>
-        <w:t xml:space="preserve"> — Istanbul, Turkey</w:t>
+        <w:t>Conectys — Istanbul, Turkey</w:t>
       </w:r>
     </w:p>
     <w:p>
@@ -753,33 +645,11 @@
       <w:pPr>
         <w:spacing w:after="60"/>
       </w:pPr>
-      <w:proofErr w:type="spellStart"/>
       <w:r>
         <w:rPr>
           <w:color w:val="595959"/>
         </w:rPr>
-        <w:t>Namık</w:t>
-      </w:r>
-      <w:proofErr w:type="spellEnd"/>
-      <w:r>
-        <w:rPr>
-          <w:color w:val="595959"/>
-        </w:rPr>
-        <w:t xml:space="preserve"> Kemal University — </w:t>
-      </w:r>
-      <w:proofErr w:type="spellStart"/>
-      <w:r>
-        <w:rPr>
-          <w:color w:val="595959"/>
-        </w:rPr>
-        <w:t>Tekirdağ</w:t>
-      </w:r>
-      <w:proofErr w:type="spellEnd"/>
-      <w:r>
-        <w:rPr>
-          <w:color w:val="595959"/>
-        </w:rPr>
-        <w:t>, Turkey</w:t>
+        <w:t>Namık Kemal University — Tekirdağ, Turkey</w:t>
       </w:r>
     </w:p>
     <w:sectPr>
@@ -793,7 +663,7 @@
 </file>
 
 <file path=word/numbering.xml><?xml version="1.0" encoding="utf-8"?>
-<w:numbering xmlns:wpc="http://schemas.microsoft.com/office/word/2010/wordprocessingCanvas" xmlns:cx="http://schemas.microsoft.com/office/drawing/2014/chartex" xmlns:cx1="http://schemas.microsoft.com/office/drawing/2015/9/8/chartex" xmlns:cx2="http://schemas.microsoft.com/office/drawing/2015/10/21/chartex" xmlns:cx3="http://schemas.microsoft.com/office/drawing/2016/5/9/chartex" xmlns:cx4="http://schemas.microsoft.com/office/drawing/2016/5/10/chartex" xmlns:cx5="http://schemas.microsoft.com/office/drawing/2016/5/11/chartex" xmlns:cx6="http://schemas.microsoft.com/office/drawing/2016/5/12/chartex" xmlns:cx7="http://schemas.microsoft.com/office/drawing/2016/5/13/chartex" xmlns:cx8="http://schemas.microsoft.com/office/drawing/2016/5/14/chartex" xmlns:mc="http://schemas.openxmlformats.org/markup-compatibility/2006" xmlns:m="http://schemas.openxmlformats.org/officeDocument/2006/math" xmlns:aink="http://schemas.microsoft.com/office/drawing/2016/ink" xmlns:am3d="http://schemas.microsoft.com/office/drawing/2017/model3d" xmlns:oel="http://schemas.microsoft.com/office/2019/extlst" xmlns:r="http://schemas.openxmlformats.org/officeDocument/2006/relationships" xmlns:wp14="http://schemas.microsoft.com/office/word/2010/wordprocessingDrawing" xmlns:wp="http://schemas.openxmlformats.org/drawingml/2006/wordprocessingDrawing" xmlns:wpg="http://schemas.microsoft.com/office/word/2010/wordprocessingGroup" xmlns:wpi="http://schemas.microsoft.com/office/word/2010/wordprocessingInk" xmlns:wps="http://schemas.microsoft.com/office/word/2010/wordprocessingShape" xmlns:o="urn:schemas-microsoft-com:office:office" xmlns:v="urn:schemas-microsoft-com:vml" xmlns:w10="urn:schemas-microsoft-com:office:word" xmlns:w="http://schemas.openxmlformats.org/wordprocessingml/2006/main" xmlns:w14="http://schemas.microsoft.com/office/word/2010/wordml" xmlns:w15="http://schemas.microsoft.com/office/word/2012/wordml" xmlns:w16cei="http://schemas.microsoft.com/office/word/2026/wordml/cei" xmlns:w16cex="http://schemas.microsoft.com/office/word/2018/wordml/cex" xmlns:w16cid="http://schemas.microsoft.com/office/word/2016/wordml/cid" xmlns:w16="http://schemas.microsoft.com/office/word/2018/wordml" xmlns:w16sdtdh="http://schemas.microsoft.com/office/word/2020/wordml/sdtdatahash" xmlns:w16sdtfl="http://schemas.microsoft.com/office/word/2024/wordml/sdtformatlock" xmlns:w16se="http://schemas.microsoft.com/office/word/2015/wordml/symex" xmlns:w16du="http://schemas.microsoft.com/office/word/2023/wordml/word16du" xmlns:wne="http://schemas.microsoft.com/office/word/2006/wordml" mc:Ignorable="w14 w15 w16se w16cid w16 w16cex w16sdtdh w16sdtfl w16du wp14">
+<w:numbering xmlns:wpc="http://schemas.microsoft.com/office/word/2010/wordprocessingCanvas" xmlns:cx="http://schemas.microsoft.com/office/drawing/2014/chartex" xmlns:cx1="http://schemas.microsoft.com/office/drawing/2015/9/8/chartex" xmlns:cx2="http://schemas.microsoft.com/office/drawing/2015/10/21/chartex" xmlns:cx3="http://schemas.microsoft.com/office/drawing/2016/5/9/chartex" xmlns:cx4="http://schemas.microsoft.com/office/drawing/2016/5/10/chartex" xmlns:cx5="http://schemas.microsoft.com/office/drawing/2016/5/11/chartex" xmlns:cx6="http://schemas.microsoft.com/office/drawing/2016/5/12/chartex" xmlns:cx7="http://schemas.microsoft.com/office/drawing/2016/5/13/chartex" xmlns:cx8="http://schemas.microsoft.com/office/drawing/2016/5/14/chartex" xmlns:mc="http://schemas.openxmlformats.org/markup-compatibility/2006" xmlns:aink="http://schemas.microsoft.com/office/drawing/2016/ink" xmlns:am3d="http://schemas.microsoft.com/office/drawing/2017/model3d" xmlns:o="urn:schemas-microsoft-com:office:office" xmlns:oel="http://schemas.microsoft.com/office/2019/extlst" xmlns:r="http://schemas.openxmlformats.org/officeDocument/2006/relationships" xmlns:m="http://schemas.openxmlformats.org/officeDocument/2006/math" xmlns:v="urn:schemas-microsoft-com:vml" xmlns:wp14="http://schemas.microsoft.com/office/word/2010/wordprocessingDrawing" xmlns:wp="http://schemas.openxmlformats.org/drawingml/2006/wordprocessingDrawing" xmlns:w10="urn:schemas-microsoft-com:office:word" xmlns:w="http://schemas.openxmlformats.org/wordprocessingml/2006/main" xmlns:w14="http://schemas.microsoft.com/office/word/2010/wordml" xmlns:w15="http://schemas.microsoft.com/office/word/2012/wordml" xmlns:w16cex="http://schemas.microsoft.com/office/word/2018/wordml/cex" xmlns:w16cid="http://schemas.microsoft.com/office/word/2016/wordml/cid" xmlns:w16="http://schemas.microsoft.com/office/word/2018/wordml" xmlns:w16du="http://schemas.microsoft.com/office/word/2023/wordml/word16du" xmlns:w16sdtdh="http://schemas.microsoft.com/office/word/2020/wordml/sdtdatahash" xmlns:w16sdtfl="http://schemas.microsoft.com/office/word/2024/wordml/sdtformatlock" xmlns:w16se="http://schemas.microsoft.com/office/word/2015/wordml/symex" xmlns:wpg="http://schemas.microsoft.com/office/word/2010/wordprocessingGroup" xmlns:wpi="http://schemas.microsoft.com/office/word/2010/wordprocessingInk" xmlns:wne="http://schemas.microsoft.com/office/word/2006/wordml" xmlns:wps="http://schemas.microsoft.com/office/word/2010/wordprocessingShape" mc:Ignorable="w14 w15 w16se w16cid w16 w16cex w16sdtdh w16sdtfl w16du wp14">
   <w:abstractNum w:abstractNumId="0" w15:restartNumberingAfterBreak="0">
     <w:nsid w:val="096B7D08"/>
     <w:multiLevelType w:val="hybridMultilevel"/>
@@ -956,7 +826,7 @@
 </file>
 
 <file path=word/styles.xml><?xml version="1.0" encoding="utf-8"?>
-<w:styles xmlns:mc="http://schemas.openxmlformats.org/markup-compatibility/2006" xmlns:r="http://schemas.openxmlformats.org/officeDocument/2006/relationships" xmlns:w="http://schemas.openxmlformats.org/wordprocessingml/2006/main" xmlns:w14="http://schemas.microsoft.com/office/word/2010/wordml" xmlns:w15="http://schemas.microsoft.com/office/word/2012/wordml" xmlns:w16cex="http://schemas.microsoft.com/office/word/2018/wordml/cex" xmlns:w16cid="http://schemas.microsoft.com/office/word/2016/wordml/cid" xmlns:w16="http://schemas.microsoft.com/office/word/2018/wordml" xmlns:w16sdtdh="http://schemas.microsoft.com/office/word/2020/wordml/sdtdatahash" xmlns:w16sdtfl="http://schemas.microsoft.com/office/word/2024/wordml/sdtformatlock" xmlns:w16se="http://schemas.microsoft.com/office/word/2015/wordml/symex" xmlns:w16du="http://schemas.microsoft.com/office/word/2023/wordml/word16du" mc:Ignorable="w14 w15 w16se w16cid w16 w16cex w16sdtdh w16sdtfl w16du">
+<w:styles xmlns:mc="http://schemas.openxmlformats.org/markup-compatibility/2006" xmlns:r="http://schemas.openxmlformats.org/officeDocument/2006/relationships" xmlns:w="http://schemas.openxmlformats.org/wordprocessingml/2006/main" xmlns:w14="http://schemas.microsoft.com/office/word/2010/wordml" xmlns:w15="http://schemas.microsoft.com/office/word/2012/wordml" xmlns:w16cex="http://schemas.microsoft.com/office/word/2018/wordml/cex" xmlns:w16cid="http://schemas.microsoft.com/office/word/2016/wordml/cid" xmlns:w16="http://schemas.microsoft.com/office/word/2018/wordml" xmlns:w16du="http://schemas.microsoft.com/office/word/2023/wordml/word16du" xmlns:w16sdtdh="http://schemas.microsoft.com/office/word/2020/wordml/sdtdatahash" xmlns:w16sdtfl="http://schemas.microsoft.com/office/word/2024/wordml/sdtformatlock" xmlns:w16se="http://schemas.microsoft.com/office/word/2015/wordml/symex" mc:Ignorable="w14 w15 w16se w16cid w16 w16cex w16sdtdh w16sdtfl w16du">
   <w:docDefaults>
     <w:rPrDefault>
       <w:rPr>

</xml_diff>